<commit_message>
Add class Q&A addendum to the UCMJ study guide
A student asked whether the apprehension-in-the-home warrant requirement
covers on-post housing or only off-post. Record the answer, since it was
promised to the class and is not on the slides.

The addendum sits after the ranked sections and is labeled as off-slide
and not expected on the exam, so it cannot be mistaken for tested material.
Tier order and every existing section are unchanged.

Also force a page break before the addendum. Without it the heading
orphaned at the bottom of the Rapid Review page with its body on the next.

PDF 12 pages. 344 content units verified against source, 105 bolded terms
preserved, no em or en dashes, TOC page numbers accurate in both formats.

Co-Authored-By: Claude Opus 5 <noreply@anthropic.com>
Claude-Session: https://claude.ai/code/session_01EYKqjVEU5BM3gdVRdgLPJZ
</commit_message>
<xml_diff>
--- a/UCMJ_Study_Guide.docx
+++ b/UCMJ_Study_Guide.docx
@@ -106,7 +106,7 @@
           <w:sz w:val="17"/>
         </w:rPr>
         <w:tab/>
-        <w:t>2</w:t>
+        <w:t>3</w:t>
       </w:r>
     </w:p>
     <w:p>
@@ -131,7 +131,7 @@
           <w:sz w:val="17"/>
         </w:rPr>
         <w:tab/>
-        <w:t>2</w:t>
+        <w:t>3</w:t>
       </w:r>
     </w:p>
     <w:p>
@@ -156,7 +156,7 @@
           <w:sz w:val="17"/>
         </w:rPr>
         <w:tab/>
-        <w:t>2</w:t>
+        <w:t>3</w:t>
       </w:r>
     </w:p>
     <w:p>
@@ -181,7 +181,7 @@
           <w:sz w:val="17"/>
         </w:rPr>
         <w:tab/>
-        <w:t>3</w:t>
+        <w:t>4</w:t>
       </w:r>
     </w:p>
     <w:p>
@@ -206,7 +206,7 @@
           <w:sz w:val="17"/>
         </w:rPr>
         <w:tab/>
-        <w:t>3</w:t>
+        <w:t>4</w:t>
       </w:r>
     </w:p>
     <w:p>
@@ -231,7 +231,7 @@
           <w:sz w:val="17"/>
         </w:rPr>
         <w:tab/>
-        <w:t>3</w:t>
+        <w:t>4</w:t>
       </w:r>
     </w:p>
     <w:p>
@@ -256,7 +256,7 @@
           <w:sz w:val="17"/>
         </w:rPr>
         <w:tab/>
-        <w:t>3</w:t>
+        <w:t>4</w:t>
       </w:r>
     </w:p>
     <w:p>
@@ -281,7 +281,7 @@
           <w:sz w:val="17"/>
         </w:rPr>
         <w:tab/>
-        <w:t>4</w:t>
+        <w:t>5</w:t>
       </w:r>
     </w:p>
     <w:p>
@@ -306,7 +306,7 @@
           <w:sz w:val="17"/>
         </w:rPr>
         <w:tab/>
-        <w:t>4</w:t>
+        <w:t>5</w:t>
       </w:r>
     </w:p>
     <w:p>
@@ -331,7 +331,7 @@
           <w:sz w:val="17"/>
         </w:rPr>
         <w:tab/>
-        <w:t>4</w:t>
+        <w:t>5</w:t>
       </w:r>
     </w:p>
     <w:p>
@@ -356,7 +356,7 @@
           <w:sz w:val="17"/>
         </w:rPr>
         <w:tab/>
-        <w:t>5</w:t>
+        <w:t>6</w:t>
       </w:r>
     </w:p>
     <w:p>
@@ -381,7 +381,7 @@
           <w:sz w:val="17"/>
         </w:rPr>
         <w:tab/>
-        <w:t>5</w:t>
+        <w:t>6</w:t>
       </w:r>
     </w:p>
     <w:p>
@@ -406,7 +406,7 @@
           <w:sz w:val="17"/>
         </w:rPr>
         <w:tab/>
-        <w:t>5</w:t>
+        <w:t>6</w:t>
       </w:r>
     </w:p>
     <w:p>
@@ -431,7 +431,7 @@
           <w:sz w:val="17"/>
         </w:rPr>
         <w:tab/>
-        <w:t>6</w:t>
+        <w:t>7</w:t>
       </w:r>
     </w:p>
     <w:p>
@@ -460,7 +460,7 @@
           <w:sz w:val="17"/>
         </w:rPr>
         <w:tab/>
-        <w:t>7</w:t>
+        <w:t>8</w:t>
       </w:r>
     </w:p>
     <w:p>
@@ -485,7 +485,7 @@
           <w:sz w:val="17"/>
         </w:rPr>
         <w:tab/>
-        <w:t>7</w:t>
+        <w:t>8</w:t>
       </w:r>
     </w:p>
     <w:p>
@@ -510,7 +510,7 @@
           <w:sz w:val="17"/>
         </w:rPr>
         <w:tab/>
-        <w:t>7</w:t>
+        <w:t>8</w:t>
       </w:r>
     </w:p>
     <w:p>
@@ -535,7 +535,7 @@
           <w:sz w:val="17"/>
         </w:rPr>
         <w:tab/>
-        <w:t>7</w:t>
+        <w:t>8</w:t>
       </w:r>
     </w:p>
     <w:p>
@@ -560,7 +560,7 @@
           <w:sz w:val="17"/>
         </w:rPr>
         <w:tab/>
-        <w:t>8</w:t>
+        <w:t>9</w:t>
       </w:r>
     </w:p>
     <w:p>
@@ -585,7 +585,7 @@
           <w:sz w:val="17"/>
         </w:rPr>
         <w:tab/>
-        <w:t>8</w:t>
+        <w:t>9</w:t>
       </w:r>
     </w:p>
     <w:p>
@@ -610,7 +610,7 @@
           <w:sz w:val="17"/>
         </w:rPr>
         <w:tab/>
-        <w:t>8</w:t>
+        <w:t>9</w:t>
       </w:r>
     </w:p>
     <w:p>
@@ -635,7 +635,7 @@
           <w:sz w:val="17"/>
         </w:rPr>
         <w:tab/>
-        <w:t>9</w:t>
+        <w:t>10</w:t>
       </w:r>
     </w:p>
     <w:p>
@@ -660,7 +660,7 @@
           <w:sz w:val="17"/>
         </w:rPr>
         <w:tab/>
-        <w:t>9</w:t>
+        <w:t>10</w:t>
       </w:r>
     </w:p>
     <w:p>
@@ -685,7 +685,7 @@
           <w:sz w:val="17"/>
         </w:rPr>
         <w:tab/>
-        <w:t>9</w:t>
+        <w:t>10</w:t>
       </w:r>
     </w:p>
     <w:p>
@@ -710,7 +710,7 @@
           <w:sz w:val="17"/>
         </w:rPr>
         <w:tab/>
-        <w:t>9</w:t>
+        <w:t>10</w:t>
       </w:r>
     </w:p>
     <w:p>
@@ -739,7 +739,7 @@
           <w:sz w:val="17"/>
         </w:rPr>
         <w:tab/>
-        <w:t>10</w:t>
+        <w:t>11</w:t>
       </w:r>
     </w:p>
     <w:p>
@@ -764,7 +764,7 @@
           <w:sz w:val="17"/>
         </w:rPr>
         <w:tab/>
-        <w:t>10</w:t>
+        <w:t>11</w:t>
       </w:r>
     </w:p>
     <w:p>
@@ -789,7 +789,7 @@
           <w:sz w:val="17"/>
         </w:rPr>
         <w:tab/>
-        <w:t>10</w:t>
+        <w:t>11</w:t>
       </w:r>
     </w:p>
     <w:p>
@@ -814,7 +814,7 @@
           <w:sz w:val="17"/>
         </w:rPr>
         <w:tab/>
-        <w:t>10</w:t>
+        <w:t>11</w:t>
       </w:r>
     </w:p>
     <w:p>
@@ -839,7 +839,7 @@
           <w:sz w:val="17"/>
         </w:rPr>
         <w:tab/>
-        <w:t>11</w:t>
+        <w:t>12</w:t>
       </w:r>
     </w:p>
     <w:p>
@@ -864,7 +864,7 @@
           <w:sz w:val="17"/>
         </w:rPr>
         <w:tab/>
-        <w:t>11</w:t>
+        <w:t>12</w:t>
       </w:r>
     </w:p>
     <w:p>
@@ -893,7 +893,7 @@
           <w:sz w:val="17"/>
         </w:rPr>
         <w:tab/>
-        <w:t>11</w:t>
+        <w:t>12</w:t>
       </w:r>
     </w:p>
     <w:p>
@@ -922,7 +922,61 @@
           <w:sz w:val="17"/>
         </w:rPr>
         <w:tab/>
-        <w:t>12</w:t>
+        <w:t>13</w:t>
+      </w:r>
+    </w:p>
+    <w:p>
+      <w:pPr>
+        <w:keepNext/>
+        <w:tabs>
+          <w:tab w:pos="9000" w:val="right" w:leader="dot"/>
+        </w:tabs>
+        <w:spacing w:before="40" w:after="10" w:line="240" w:lineRule="auto"/>
+        <w:ind w:left="0" w:firstLine="0"/>
+      </w:pPr>
+      <w:r>
+        <w:rPr>
+          <w:rFonts w:ascii="Arial" w:hAnsi="Arial" w:cs="Arial"/>
+          <w:b/>
+          <w:color w:val="1F3A5F"/>
+          <w:sz w:val="18"/>
+        </w:rPr>
+        <w:t>Addendum: Asked in Class</w:t>
+      </w:r>
+      <w:r>
+        <w:rPr>
+          <w:rFonts w:ascii="Arial" w:hAnsi="Arial" w:cs="Arial"/>
+          <w:b/>
+          <w:color w:val="1F3A5F"/>
+          <w:sz w:val="17"/>
+        </w:rPr>
+        <w:tab/>
+        <w:t>14</w:t>
+      </w:r>
+    </w:p>
+    <w:p>
+      <w:pPr>
+        <w:keepNext w:val="0"/>
+        <w:tabs>
+          <w:tab w:pos="9000" w:val="right" w:leader="dot"/>
+        </w:tabs>
+        <w:spacing w:before="0" w:after="10" w:line="240" w:lineRule="auto"/>
+        <w:ind w:left="288" w:firstLine="0"/>
+      </w:pPr>
+      <w:r>
+        <w:rPr>
+          <w:rFonts w:ascii="Times New Roman" w:hAnsi="Times New Roman" w:cs="Times New Roman"/>
+          <w:sz w:val="18"/>
+        </w:rPr>
+        <w:t>A.1 Apprehension in the home: on post or off post? (Slide 28)</w:t>
+      </w:r>
+      <w:r>
+        <w:rPr>
+          <w:rFonts w:ascii="Arial" w:hAnsi="Arial" w:cs="Arial"/>
+          <w:sz w:val="17"/>
+        </w:rPr>
+        <w:tab/>
+        <w:t>14</w:t>
       </w:r>
       <w:r>
         <w:fldChar w:fldCharType="end"/>
@@ -9561,6 +9615,324 @@
           <w:sz w:val="22"/>
         </w:rPr>
         <w:t>regardless of knowledge or intent</w:t>
+      </w:r>
+    </w:p>
+    <w:p>
+      <w:pPr>
+        <w:keepNext/>
+        <w:pageBreakBefore/>
+        <w:pBdr>
+          <w:bottom w:val="single" w:sz="16" w:space="2" w:color="1F3A5F"/>
+        </w:pBdr>
+        <w:spacing w:before="0" w:after="80"/>
+        <w:outlineLvl w:val="0"/>
+      </w:pPr>
+      <w:r>
+        <w:rPr>
+          <w:rFonts w:ascii="Arial" w:hAnsi="Arial" w:cs="Arial"/>
+          <w:b/>
+          <w:color w:val="1F3A5F"/>
+          <w:sz w:val="36"/>
+        </w:rPr>
+        <w:t>Addendum: Asked in Class</w:t>
+      </w:r>
+    </w:p>
+    <w:p>
+      <w:pPr>
+        <w:keepNext/>
+        <w:spacing w:before="100" w:after="160"/>
+      </w:pPr>
+    </w:p>
+    <w:p>
+      <w:pPr>
+        <w:spacing w:after="100" w:line="326" w:lineRule="auto"/>
+      </w:pPr>
+      <w:r>
+        <w:rPr>
+          <w:rFonts w:ascii="Times New Roman" w:hAnsi="Times New Roman" w:cs="Times New Roman"/>
+          <w:b/>
+          <w:sz w:val="22"/>
+        </w:rPr>
+        <w:t>Not on the slides, and not expected on the exam.</w:t>
+      </w:r>
+      <w:r>
+        <w:rPr>
+          <w:rFonts w:ascii="Times New Roman" w:hAnsi="Times New Roman" w:cs="Times New Roman"/>
+          <w:sz w:val="22"/>
+        </w:rPr>
+        <w:t xml:space="preserve"> This is here because it was asked during the class and an answer was promised.</w:t>
+      </w:r>
+    </w:p>
+    <w:p>
+      <w:pPr>
+        <w:keepNext/>
+        <w:pBdr>
+          <w:bottom w:val="single" w:sz="4" w:space="2" w:color="C4C4C4"/>
+        </w:pBdr>
+        <w:spacing w:before="150" w:after="70"/>
+        <w:outlineLvl w:val="1"/>
+      </w:pPr>
+      <w:r>
+        <w:rPr>
+          <w:rFonts w:ascii="Arial" w:hAnsi="Arial" w:cs="Arial"/>
+          <w:b/>
+          <w:color w:val="1F3A5F"/>
+          <w:sz w:val="25"/>
+        </w:rPr>
+        <w:t>A.1 Apprehension in the home: on post or off post? (Slide 28)</w:t>
+      </w:r>
+    </w:p>
+    <w:p>
+      <w:pPr>
+        <w:spacing w:after="100" w:line="326" w:lineRule="auto"/>
+      </w:pPr>
+      <w:r>
+        <w:rPr>
+          <w:rFonts w:ascii="Times New Roman" w:hAnsi="Times New Roman" w:cs="Times New Roman"/>
+          <w:sz w:val="22"/>
+        </w:rPr>
+        <w:t>The deck says apprehension in the home requires a warrant. The question asked was whether "home" means a house on post or a house off post.</w:t>
+      </w:r>
+    </w:p>
+    <w:p>
+      <w:pPr>
+        <w:spacing w:after="100" w:line="326" w:lineRule="auto"/>
+      </w:pPr>
+      <w:r>
+        <w:rPr>
+          <w:rFonts w:ascii="Times New Roman" w:hAnsi="Times New Roman" w:cs="Times New Roman"/>
+          <w:sz w:val="22"/>
+        </w:rPr>
+        <w:t xml:space="preserve">The dividing line is not on post versus off post. It is whether the place is a </w:t>
+      </w:r>
+      <w:r>
+        <w:rPr>
+          <w:rFonts w:ascii="Times New Roman" w:hAnsi="Times New Roman" w:cs="Times New Roman"/>
+          <w:b/>
+          <w:sz w:val="22"/>
+        </w:rPr>
+        <w:t>private dwelling</w:t>
+      </w:r>
+      <w:r>
+        <w:rPr>
+          <w:rFonts w:ascii="Times New Roman" w:hAnsi="Times New Roman" w:cs="Times New Roman"/>
+          <w:sz w:val="22"/>
+        </w:rPr>
+        <w:t xml:space="preserve"> under </w:t>
+      </w:r>
+      <w:r>
+        <w:rPr>
+          <w:rFonts w:ascii="Times New Roman" w:hAnsi="Times New Roman" w:cs="Times New Roman"/>
+          <w:b/>
+          <w:sz w:val="22"/>
+        </w:rPr>
+        <w:t>R.C.M. 302(e)(2)</w:t>
+      </w:r>
+      <w:r>
+        <w:rPr>
+          <w:rFonts w:ascii="Times New Roman" w:hAnsi="Times New Roman" w:cs="Times New Roman"/>
+          <w:sz w:val="22"/>
+        </w:rPr>
+        <w:t>.</w:t>
+      </w:r>
+    </w:p>
+    <w:p>
+      <w:pPr>
+        <w:spacing w:after="100" w:line="326" w:lineRule="auto"/>
+      </w:pPr>
+      <w:r>
+        <w:rPr>
+          <w:rFonts w:ascii="Times New Roman" w:hAnsi="Times New Roman" w:cs="Times New Roman"/>
+          <w:sz w:val="22"/>
+        </w:rPr>
+        <w:t>Counts as a private dwelling:</w:t>
+      </w:r>
+    </w:p>
+    <w:p>
+      <w:pPr>
+        <w:tabs>
+          <w:tab w:pos="432" w:val="left"/>
+        </w:tabs>
+        <w:spacing w:after="30" w:before="0" w:line="326" w:lineRule="auto"/>
+        <w:ind w:left="432" w:hanging="317"/>
+      </w:pPr>
+      <w:r>
+        <w:rPr>
+          <w:rFonts w:ascii="Times New Roman" w:hAnsi="Times New Roman" w:cs="Times New Roman"/>
+          <w:sz w:val="22"/>
+        </w:rPr>
+        <w:t>•</w:t>
+        <w:tab/>
+      </w:r>
+      <w:r>
+        <w:rPr>
+          <w:rFonts w:ascii="Times New Roman" w:hAnsi="Times New Roman" w:cs="Times New Roman"/>
+          <w:sz w:val="22"/>
+        </w:rPr>
+        <w:t>Single family houses, duplexes, and apartments</w:t>
+      </w:r>
+    </w:p>
+    <w:p>
+      <w:pPr>
+        <w:tabs>
+          <w:tab w:pos="432" w:val="left"/>
+        </w:tabs>
+        <w:spacing w:after="30" w:before="0" w:line="326" w:lineRule="auto"/>
+        <w:ind w:left="432" w:hanging="317"/>
+      </w:pPr>
+      <w:r>
+        <w:rPr>
+          <w:rFonts w:ascii="Times New Roman" w:hAnsi="Times New Roman" w:cs="Times New Roman"/>
+          <w:sz w:val="22"/>
+        </w:rPr>
+        <w:t>•</w:t>
+        <w:tab/>
+      </w:r>
+      <w:r>
+        <w:rPr>
+          <w:rFonts w:ascii="Times New Roman" w:hAnsi="Times New Roman" w:cs="Times New Roman"/>
+          <w:b/>
+          <w:sz w:val="22"/>
+        </w:rPr>
+        <w:t>Government quarters on post</w:t>
+      </w:r>
+      <w:r>
+        <w:rPr>
+          <w:rFonts w:ascii="Times New Roman" w:hAnsi="Times New Roman" w:cs="Times New Roman"/>
+          <w:sz w:val="22"/>
+        </w:rPr>
+        <w:t>, same as a residence off post</w:t>
+      </w:r>
+    </w:p>
+    <w:p>
+      <w:pPr>
+        <w:spacing w:after="100" w:line="326" w:lineRule="auto"/>
+      </w:pPr>
+      <w:r>
+        <w:rPr>
+          <w:rFonts w:ascii="Times New Roman" w:hAnsi="Times New Roman" w:cs="Times New Roman"/>
+          <w:sz w:val="22"/>
+        </w:rPr>
+        <w:t>Does not count as a private dwelling:</w:t>
+      </w:r>
+    </w:p>
+    <w:p>
+      <w:pPr>
+        <w:tabs>
+          <w:tab w:pos="432" w:val="left"/>
+        </w:tabs>
+        <w:spacing w:after="30" w:before="0" w:line="326" w:lineRule="auto"/>
+        <w:ind w:left="432" w:hanging="317"/>
+      </w:pPr>
+      <w:r>
+        <w:rPr>
+          <w:rFonts w:ascii="Times New Roman" w:hAnsi="Times New Roman" w:cs="Times New Roman"/>
+          <w:sz w:val="22"/>
+        </w:rPr>
+        <w:t>•</w:t>
+        <w:tab/>
+      </w:r>
+      <w:r>
+        <w:rPr>
+          <w:rFonts w:ascii="Times New Roman" w:hAnsi="Times New Roman" w:cs="Times New Roman"/>
+          <w:sz w:val="22"/>
+        </w:rPr>
+        <w:t xml:space="preserve">Living areas in </w:t>
+      </w:r>
+      <w:r>
+        <w:rPr>
+          <w:rFonts w:ascii="Times New Roman" w:hAnsi="Times New Roman" w:cs="Times New Roman"/>
+          <w:b/>
+          <w:sz w:val="22"/>
+        </w:rPr>
+        <w:t>barracks</w:t>
+      </w:r>
+    </w:p>
+    <w:p>
+      <w:pPr>
+        <w:tabs>
+          <w:tab w:pos="432" w:val="left"/>
+        </w:tabs>
+        <w:spacing w:after="30" w:before="0" w:line="326" w:lineRule="auto"/>
+        <w:ind w:left="432" w:hanging="317"/>
+      </w:pPr>
+      <w:r>
+        <w:rPr>
+          <w:rFonts w:ascii="Times New Roman" w:hAnsi="Times New Roman" w:cs="Times New Roman"/>
+          <w:sz w:val="22"/>
+        </w:rPr>
+        <w:t>•</w:t>
+        <w:tab/>
+      </w:r>
+      <w:r>
+        <w:rPr>
+          <w:rFonts w:ascii="Times New Roman" w:hAnsi="Times New Roman" w:cs="Times New Roman"/>
+          <w:sz w:val="22"/>
+        </w:rPr>
+        <w:t>Vessels, aircraft, and vehicles</w:t>
+      </w:r>
+    </w:p>
+    <w:p>
+      <w:pPr>
+        <w:tabs>
+          <w:tab w:pos="432" w:val="left"/>
+        </w:tabs>
+        <w:spacing w:after="30" w:before="0" w:line="326" w:lineRule="auto"/>
+        <w:ind w:left="432" w:hanging="317"/>
+      </w:pPr>
+      <w:r>
+        <w:rPr>
+          <w:rFonts w:ascii="Times New Roman" w:hAnsi="Times New Roman" w:cs="Times New Roman"/>
+          <w:sz w:val="22"/>
+        </w:rPr>
+        <w:t>•</w:t>
+        <w:tab/>
+      </w:r>
+      <w:r>
+        <w:rPr>
+          <w:rFonts w:ascii="Times New Roman" w:hAnsi="Times New Roman" w:cs="Times New Roman"/>
+          <w:sz w:val="22"/>
+        </w:rPr>
+        <w:t>Tents, bunkers, and field encampments</w:t>
+      </w:r>
+    </w:p>
+    <w:p>
+      <w:pPr>
+        <w:spacing w:after="100" w:line="326" w:lineRule="auto"/>
+      </w:pPr>
+      <w:r>
+        <w:rPr>
+          <w:rFonts w:ascii="Times New Roman" w:hAnsi="Times New Roman" w:cs="Times New Roman"/>
+          <w:sz w:val="22"/>
+        </w:rPr>
+        <w:t>So a house on post receives the same protection as a house off post. A barracks room does not.</w:t>
+      </w:r>
+    </w:p>
+    <w:p>
+      <w:pPr>
+        <w:spacing w:after="100" w:line="326" w:lineRule="auto"/>
+      </w:pPr>
+      <w:r>
+        <w:rPr>
+          <w:rFonts w:ascii="Times New Roman" w:hAnsi="Times New Roman" w:cs="Times New Roman"/>
+          <w:sz w:val="22"/>
+        </w:rPr>
+        <w:t xml:space="preserve">One practical note: in the military the instrument is usually an </w:t>
+      </w:r>
+      <w:r>
+        <w:rPr>
+          <w:rFonts w:ascii="Times New Roman" w:hAnsi="Times New Roman" w:cs="Times New Roman"/>
+          <w:b/>
+          <w:sz w:val="22"/>
+        </w:rPr>
+        <w:t>apprehension authorization</w:t>
+      </w:r>
+      <w:r>
+        <w:rPr>
+          <w:rFonts w:ascii="Times New Roman" w:hAnsi="Times New Roman" w:cs="Times New Roman"/>
+          <w:sz w:val="22"/>
+        </w:rPr>
+        <w:t xml:space="preserve"> from a commander, military judge, or military magistrate rather than a civilian judge's warrant. Functionally it is the same idea, someone neutral has to approve the entry.</w:t>
       </w:r>
     </w:p>
     <w:sectPr>

</xml_diff>

<commit_message>
Use real heading styles so the guide imports cleanly into Google Docs
Apply Word's built-in Heading 1/2/3 styles to the tier, section, and
subsection headings instead of direct formatting alone. Google Docs reads
those styles to build its outline sidebar and to generate a live table of
contents, neither of which worked when the headings were only visually
formatted. Appearance is unchanged, since run-level font and color still
override the style defaults.

Tighten the contents list to absorb the two entries the addendum added,
which had pushed the front matter onto a near-empty second page.

13 pages. Contents page numbers verified against actual layout, 344 content
units matched, 105 bolded terms preserved, no em or en dashes.

Co-Authored-By: Claude Opus 5 <noreply@anthropic.com>
Claude-Session: https://claude.ai/code/session_01EYKqjVEU5BM3gdVRdgLPJZ
</commit_message>
<xml_diff>
--- a/UCMJ_Study_Guide.docx
+++ b/UCMJ_Study_Guide.docx
@@ -77,7 +77,7 @@
         <w:tabs>
           <w:tab w:pos="9000" w:val="right" w:leader="dot"/>
         </w:tabs>
-        <w:spacing w:before="40" w:after="10" w:line="240" w:lineRule="auto"/>
+        <w:spacing w:before="30" w:after="5" w:line="240" w:lineRule="auto"/>
         <w:ind w:left="0" w:firstLine="0"/>
       </w:pPr>
       <w:r>
@@ -88,15 +88,6 @@
       </w:r>
       <w:r>
         <w:fldChar w:fldCharType="separate"/>
-      </w:r>
-      <w:r>
-        <w:rPr>
-          <w:rFonts w:ascii="Arial" w:hAnsi="Arial" w:cs="Arial"/>
-          <w:b/>
-          <w:color w:val="1F3A5F"/>
-          <w:sz w:val="18"/>
-        </w:rPr>
-        <w:t>TIER 1: Know These Cold</w:t>
       </w:r>
       <w:r>
         <w:rPr>
@@ -105,8 +96,17 @@
           <w:color w:val="1F3A5F"/>
           <w:sz w:val="17"/>
         </w:rPr>
+        <w:t>TIER 1: Know These Cold</w:t>
+      </w:r>
+      <w:r>
+        <w:rPr>
+          <w:rFonts w:ascii="Arial" w:hAnsi="Arial" w:cs="Arial"/>
+          <w:b/>
+          <w:color w:val="1F3A5F"/>
+          <w:sz w:val="16"/>
+        </w:rPr>
         <w:tab/>
-        <w:t>3</w:t>
+        <w:t>2</w:t>
       </w:r>
     </w:p>
     <w:p>
@@ -115,23 +115,23 @@
         <w:tabs>
           <w:tab w:pos="9000" w:val="right" w:leader="dot"/>
         </w:tabs>
-        <w:spacing w:before="0" w:after="10" w:line="240" w:lineRule="auto"/>
+        <w:spacing w:before="0" w:after="5" w:line="240" w:lineRule="auto"/>
         <w:ind w:left="288" w:firstLine="0"/>
       </w:pPr>
       <w:r>
         <w:rPr>
           <w:rFonts w:ascii="Times New Roman" w:hAnsi="Times New Roman" w:cs="Times New Roman"/>
-          <w:sz w:val="18"/>
+          <w:sz w:val="17"/>
         </w:rPr>
         <w:t>1.1 Article 31(b) Rights Warning (Slide 32)</w:t>
       </w:r>
       <w:r>
         <w:rPr>
           <w:rFonts w:ascii="Arial" w:hAnsi="Arial" w:cs="Arial"/>
-          <w:sz w:val="17"/>
+          <w:sz w:val="16"/>
         </w:rPr>
         <w:tab/>
-        <w:t>3</w:t>
+        <w:t>2</w:t>
       </w:r>
     </w:p>
     <w:p>
@@ -140,23 +140,23 @@
         <w:tabs>
           <w:tab w:pos="9000" w:val="right" w:leader="dot"/>
         </w:tabs>
-        <w:spacing w:before="0" w:after="10" w:line="240" w:lineRule="auto"/>
+        <w:spacing w:before="0" w:after="5" w:line="240" w:lineRule="auto"/>
         <w:ind w:left="288" w:firstLine="0"/>
       </w:pPr>
       <w:r>
         <w:rPr>
           <w:rFonts w:ascii="Times New Roman" w:hAnsi="Times New Roman" w:cs="Times New Roman"/>
-          <w:sz w:val="18"/>
+          <w:sz w:val="17"/>
         </w:rPr>
         <w:t>1.2 Who May Authorize a Search and Seizure (Slide 27)</w:t>
       </w:r>
       <w:r>
         <w:rPr>
           <w:rFonts w:ascii="Arial" w:hAnsi="Arial" w:cs="Arial"/>
-          <w:sz w:val="17"/>
+          <w:sz w:val="16"/>
         </w:rPr>
         <w:tab/>
-        <w:t>3</w:t>
+        <w:t>2</w:t>
       </w:r>
     </w:p>
     <w:p>
@@ -165,23 +165,23 @@
         <w:tabs>
           <w:tab w:pos="9000" w:val="right" w:leader="dot"/>
         </w:tabs>
-        <w:spacing w:before="0" w:after="10" w:line="240" w:lineRule="auto"/>
+        <w:spacing w:before="0" w:after="5" w:line="240" w:lineRule="auto"/>
         <w:ind w:left="288" w:firstLine="0"/>
       </w:pPr>
       <w:r>
         <w:rPr>
           <w:rFonts w:ascii="Times New Roman" w:hAnsi="Times New Roman" w:cs="Times New Roman"/>
-          <w:sz w:val="18"/>
+          <w:sz w:val="17"/>
         </w:rPr>
         <w:t>1.3 Rights of a Soldier Under Article 15 (Slide 11)</w:t>
       </w:r>
       <w:r>
         <w:rPr>
           <w:rFonts w:ascii="Arial" w:hAnsi="Arial" w:cs="Arial"/>
-          <w:sz w:val="17"/>
+          <w:sz w:val="16"/>
         </w:rPr>
         <w:tab/>
-        <w:t>4</w:t>
+        <w:t>3</w:t>
       </w:r>
     </w:p>
     <w:p>
@@ -190,23 +190,23 @@
         <w:tabs>
           <w:tab w:pos="9000" w:val="right" w:leader="dot"/>
         </w:tabs>
-        <w:spacing w:before="0" w:after="10" w:line="240" w:lineRule="auto"/>
+        <w:spacing w:before="0" w:after="5" w:line="240" w:lineRule="auto"/>
         <w:ind w:left="288" w:firstLine="0"/>
       </w:pPr>
       <w:r>
         <w:rPr>
           <w:rFonts w:ascii="Times New Roman" w:hAnsi="Times New Roman" w:cs="Times New Roman"/>
-          <w:sz w:val="18"/>
+          <w:sz w:val="17"/>
         </w:rPr>
         <w:t>1.4 Article 15 Commander's Inquiry (Slide 10)</w:t>
       </w:r>
       <w:r>
         <w:rPr>
           <w:rFonts w:ascii="Arial" w:hAnsi="Arial" w:cs="Arial"/>
-          <w:sz w:val="17"/>
+          <w:sz w:val="16"/>
         </w:rPr>
         <w:tab/>
-        <w:t>4</w:t>
+        <w:t>3</w:t>
       </w:r>
     </w:p>
     <w:p>
@@ -215,23 +215,23 @@
         <w:tabs>
           <w:tab w:pos="9000" w:val="right" w:leader="dot"/>
         </w:tabs>
-        <w:spacing w:before="0" w:after="10" w:line="240" w:lineRule="auto"/>
+        <w:spacing w:before="0" w:after="5" w:line="240" w:lineRule="auto"/>
         <w:ind w:left="288" w:firstLine="0"/>
       </w:pPr>
       <w:r>
         <w:rPr>
           <w:rFonts w:ascii="Times New Roman" w:hAnsi="Times New Roman" w:cs="Times New Roman"/>
-          <w:sz w:val="18"/>
+          <w:sz w:val="17"/>
         </w:rPr>
         <w:t>1.5 Types of Court-Martial (Slide 12)</w:t>
       </w:r>
       <w:r>
         <w:rPr>
           <w:rFonts w:ascii="Arial" w:hAnsi="Arial" w:cs="Arial"/>
-          <w:sz w:val="17"/>
+          <w:sz w:val="16"/>
         </w:rPr>
         <w:tab/>
-        <w:t>4</w:t>
+        <w:t>3</w:t>
       </w:r>
     </w:p>
     <w:p>
@@ -240,23 +240,23 @@
         <w:tabs>
           <w:tab w:pos="9000" w:val="right" w:leader="dot"/>
         </w:tabs>
-        <w:spacing w:before="0" w:after="10" w:line="240" w:lineRule="auto"/>
+        <w:spacing w:before="0" w:after="5" w:line="240" w:lineRule="auto"/>
         <w:ind w:left="288" w:firstLine="0"/>
       </w:pPr>
       <w:r>
         <w:rPr>
           <w:rFonts w:ascii="Times New Roman" w:hAnsi="Times New Roman" w:cs="Times New Roman"/>
-          <w:sz w:val="18"/>
+          <w:sz w:val="17"/>
         </w:rPr>
         <w:t>1.6 Administrative Separations: Characterization of Service (Slide 20)</w:t>
       </w:r>
       <w:r>
         <w:rPr>
           <w:rFonts w:ascii="Arial" w:hAnsi="Arial" w:cs="Arial"/>
-          <w:sz w:val="17"/>
+          <w:sz w:val="16"/>
         </w:rPr>
         <w:tab/>
-        <w:t>4</w:t>
+        <w:t>3</w:t>
       </w:r>
     </w:p>
     <w:p>
@@ -265,23 +265,23 @@
         <w:tabs>
           <w:tab w:pos="9000" w:val="right" w:leader="dot"/>
         </w:tabs>
-        <w:spacing w:before="0" w:after="10" w:line="240" w:lineRule="auto"/>
+        <w:spacing w:before="0" w:after="5" w:line="240" w:lineRule="auto"/>
         <w:ind w:left="288" w:firstLine="0"/>
       </w:pPr>
       <w:r>
         <w:rPr>
           <w:rFonts w:ascii="Times New Roman" w:hAnsi="Times New Roman" w:cs="Times New Roman"/>
-          <w:sz w:val="18"/>
+          <w:sz w:val="17"/>
         </w:rPr>
         <w:t>1.7 Separation Board Entitlement (Slide 19)</w:t>
       </w:r>
       <w:r>
         <w:rPr>
           <w:rFonts w:ascii="Arial" w:hAnsi="Arial" w:cs="Arial"/>
-          <w:sz w:val="17"/>
+          <w:sz w:val="16"/>
         </w:rPr>
         <w:tab/>
-        <w:t>5</w:t>
+        <w:t>4</w:t>
       </w:r>
     </w:p>
     <w:p>
@@ -290,23 +290,23 @@
         <w:tabs>
           <w:tab w:pos="9000" w:val="right" w:leader="dot"/>
         </w:tabs>
-        <w:spacing w:before="0" w:after="10" w:line="240" w:lineRule="auto"/>
+        <w:spacing w:before="0" w:after="5" w:line="240" w:lineRule="auto"/>
         <w:ind w:left="288" w:firstLine="0"/>
       </w:pPr>
       <w:r>
         <w:rPr>
           <w:rFonts w:ascii="Times New Roman" w:hAnsi="Times New Roman" w:cs="Times New Roman"/>
-          <w:sz w:val="18"/>
+          <w:sz w:val="17"/>
         </w:rPr>
         <w:t>1.8 Chapters for Involuntary Separation (Slides 21 to 22)</w:t>
       </w:r>
       <w:r>
         <w:rPr>
           <w:rFonts w:ascii="Arial" w:hAnsi="Arial" w:cs="Arial"/>
-          <w:sz w:val="17"/>
+          <w:sz w:val="16"/>
         </w:rPr>
         <w:tab/>
-        <w:t>5</w:t>
+        <w:t>4</w:t>
       </w:r>
     </w:p>
     <w:p>
@@ -315,23 +315,23 @@
         <w:tabs>
           <w:tab w:pos="9000" w:val="right" w:leader="dot"/>
         </w:tabs>
-        <w:spacing w:before="0" w:after="10" w:line="240" w:lineRule="auto"/>
+        <w:spacing w:before="0" w:after="5" w:line="240" w:lineRule="auto"/>
         <w:ind w:left="288" w:firstLine="0"/>
       </w:pPr>
       <w:r>
         <w:rPr>
           <w:rFonts w:ascii="Times New Roman" w:hAnsi="Times New Roman" w:cs="Times New Roman"/>
-          <w:sz w:val="18"/>
+          <w:sz w:val="17"/>
         </w:rPr>
         <w:t>1.9 Articles 133 and 134 (Slides 5 to 6)</w:t>
       </w:r>
       <w:r>
         <w:rPr>
           <w:rFonts w:ascii="Arial" w:hAnsi="Arial" w:cs="Arial"/>
-          <w:sz w:val="17"/>
+          <w:sz w:val="16"/>
         </w:rPr>
         <w:tab/>
-        <w:t>5</w:t>
+        <w:t>4</w:t>
       </w:r>
     </w:p>
     <w:p>
@@ -340,23 +340,23 @@
         <w:tabs>
           <w:tab w:pos="9000" w:val="right" w:leader="dot"/>
         </w:tabs>
-        <w:spacing w:before="0" w:after="10" w:line="240" w:lineRule="auto"/>
+        <w:spacing w:before="0" w:after="5" w:line="240" w:lineRule="auto"/>
         <w:ind w:left="288" w:firstLine="0"/>
       </w:pPr>
       <w:r>
         <w:rPr>
           <w:rFonts w:ascii="Times New Roman" w:hAnsi="Times New Roman" w:cs="Times New Roman"/>
-          <w:sz w:val="18"/>
+          <w:sz w:val="17"/>
         </w:rPr>
         <w:t>1.10 Pretrial Restraint (Slide 35)</w:t>
       </w:r>
       <w:r>
         <w:rPr>
           <w:rFonts w:ascii="Arial" w:hAnsi="Arial" w:cs="Arial"/>
-          <w:sz w:val="17"/>
+          <w:sz w:val="16"/>
         </w:rPr>
         <w:tab/>
-        <w:t>6</w:t>
+        <w:t>5</w:t>
       </w:r>
     </w:p>
     <w:p>
@@ -365,23 +365,23 @@
         <w:tabs>
           <w:tab w:pos="9000" w:val="right" w:leader="dot"/>
         </w:tabs>
-        <w:spacing w:before="0" w:after="10" w:line="240" w:lineRule="auto"/>
+        <w:spacing w:before="0" w:after="5" w:line="240" w:lineRule="auto"/>
         <w:ind w:left="288" w:firstLine="0"/>
       </w:pPr>
       <w:r>
         <w:rPr>
           <w:rFonts w:ascii="Times New Roman" w:hAnsi="Times New Roman" w:cs="Times New Roman"/>
-          <w:sz w:val="18"/>
+          <w:sz w:val="17"/>
         </w:rPr>
         <w:t>1.11 Article 32 Preliminary Hearing (Slides 25 to 26)</w:t>
       </w:r>
       <w:r>
         <w:rPr>
           <w:rFonts w:ascii="Arial" w:hAnsi="Arial" w:cs="Arial"/>
-          <w:sz w:val="17"/>
+          <w:sz w:val="16"/>
         </w:rPr>
         <w:tab/>
-        <w:t>6</w:t>
+        <w:t>5</w:t>
       </w:r>
     </w:p>
     <w:p>
@@ -390,23 +390,23 @@
         <w:tabs>
           <w:tab w:pos="9000" w:val="right" w:leader="dot"/>
         </w:tabs>
-        <w:spacing w:before="0" w:after="10" w:line="240" w:lineRule="auto"/>
+        <w:spacing w:before="0" w:after="5" w:line="240" w:lineRule="auto"/>
         <w:ind w:left="288" w:firstLine="0"/>
       </w:pPr>
       <w:r>
         <w:rPr>
           <w:rFonts w:ascii="Times New Roman" w:hAnsi="Times New Roman" w:cs="Times New Roman"/>
-          <w:sz w:val="18"/>
+          <w:sz w:val="17"/>
         </w:rPr>
         <w:t>1.12 Mandatory Bar Grounds, Directive 2012-03 (Slide 18)</w:t>
       </w:r>
       <w:r>
         <w:rPr>
           <w:rFonts w:ascii="Arial" w:hAnsi="Arial" w:cs="Arial"/>
-          <w:sz w:val="17"/>
+          <w:sz w:val="16"/>
         </w:rPr>
         <w:tab/>
-        <w:t>6</w:t>
+        <w:t>5</w:t>
       </w:r>
     </w:p>
     <w:p>
@@ -415,23 +415,23 @@
         <w:tabs>
           <w:tab w:pos="9000" w:val="right" w:leader="dot"/>
         </w:tabs>
-        <w:spacing w:before="0" w:after="10" w:line="240" w:lineRule="auto"/>
+        <w:spacing w:before="0" w:after="5" w:line="240" w:lineRule="auto"/>
         <w:ind w:left="288" w:firstLine="0"/>
       </w:pPr>
       <w:r>
         <w:rPr>
           <w:rFonts w:ascii="Times New Roman" w:hAnsi="Times New Roman" w:cs="Times New Roman"/>
-          <w:sz w:val="18"/>
+          <w:sz w:val="17"/>
         </w:rPr>
         <w:t>1.13 Counseling Essentials (Slide 14)</w:t>
       </w:r>
       <w:r>
         <w:rPr>
           <w:rFonts w:ascii="Arial" w:hAnsi="Arial" w:cs="Arial"/>
-          <w:sz w:val="17"/>
+          <w:sz w:val="16"/>
         </w:rPr>
         <w:tab/>
-        <w:t>7</w:t>
+        <w:t>6</w:t>
       </w:r>
     </w:p>
     <w:p>
@@ -440,18 +440,9 @@
         <w:tabs>
           <w:tab w:pos="9000" w:val="right" w:leader="dot"/>
         </w:tabs>
-        <w:spacing w:before="40" w:after="10" w:line="240" w:lineRule="auto"/>
+        <w:spacing w:before="30" w:after="5" w:line="240" w:lineRule="auto"/>
         <w:ind w:left="0" w:firstLine="0"/>
       </w:pPr>
-      <w:r>
-        <w:rPr>
-          <w:rFonts w:ascii="Arial" w:hAnsi="Arial" w:cs="Arial"/>
-          <w:b/>
-          <w:color w:val="1F3A5F"/>
-          <w:sz w:val="18"/>
-        </w:rPr>
-        <w:t>TIER 2: Likely Tested, Concept Level</w:t>
-      </w:r>
       <w:r>
         <w:rPr>
           <w:rFonts w:ascii="Arial" w:hAnsi="Arial" w:cs="Arial"/>
@@ -459,8 +450,17 @@
           <w:color w:val="1F3A5F"/>
           <w:sz w:val="17"/>
         </w:rPr>
+        <w:t>TIER 2: Likely Tested, Concept Level</w:t>
+      </w:r>
+      <w:r>
+        <w:rPr>
+          <w:rFonts w:ascii="Arial" w:hAnsi="Arial" w:cs="Arial"/>
+          <w:b/>
+          <w:color w:val="1F3A5F"/>
+          <w:sz w:val="16"/>
+        </w:rPr>
         <w:tab/>
-        <w:t>8</w:t>
+        <w:t>7</w:t>
       </w:r>
     </w:p>
     <w:p>
@@ -469,23 +469,23 @@
         <w:tabs>
           <w:tab w:pos="9000" w:val="right" w:leader="dot"/>
         </w:tabs>
-        <w:spacing w:before="0" w:after="10" w:line="240" w:lineRule="auto"/>
+        <w:spacing w:before="0" w:after="5" w:line="240" w:lineRule="auto"/>
         <w:ind w:left="288" w:firstLine="0"/>
       </w:pPr>
       <w:r>
         <w:rPr>
           <w:rFonts w:ascii="Times New Roman" w:hAnsi="Times New Roman" w:cs="Times New Roman"/>
-          <w:sz w:val="18"/>
+          <w:sz w:val="17"/>
         </w:rPr>
         <w:t>2.1 UCMJ Jurisdiction (Slide 3)</w:t>
       </w:r>
       <w:r>
         <w:rPr>
           <w:rFonts w:ascii="Arial" w:hAnsi="Arial" w:cs="Arial"/>
-          <w:sz w:val="17"/>
+          <w:sz w:val="16"/>
         </w:rPr>
         <w:tab/>
-        <w:t>8</w:t>
+        <w:t>7</w:t>
       </w:r>
     </w:p>
     <w:p>
@@ -494,23 +494,23 @@
         <w:tabs>
           <w:tab w:pos="9000" w:val="right" w:leader="dot"/>
         </w:tabs>
-        <w:spacing w:before="0" w:after="10" w:line="240" w:lineRule="auto"/>
+        <w:spacing w:before="0" w:after="5" w:line="240" w:lineRule="auto"/>
         <w:ind w:left="288" w:firstLine="0"/>
       </w:pPr>
       <w:r>
         <w:rPr>
           <w:rFonts w:ascii="Times New Roman" w:hAnsi="Times New Roman" w:cs="Times New Roman"/>
-          <w:sz w:val="18"/>
+          <w:sz w:val="17"/>
         </w:rPr>
         <w:t>2.2 Inspections Versus Searches (Slide 31)</w:t>
       </w:r>
       <w:r>
         <w:rPr>
           <w:rFonts w:ascii="Arial" w:hAnsi="Arial" w:cs="Arial"/>
-          <w:sz w:val="17"/>
+          <w:sz w:val="16"/>
         </w:rPr>
         <w:tab/>
-        <w:t>8</w:t>
+        <w:t>7</w:t>
       </w:r>
     </w:p>
     <w:p>
@@ -519,23 +519,23 @@
         <w:tabs>
           <w:tab w:pos="9000" w:val="right" w:leader="dot"/>
         </w:tabs>
-        <w:spacing w:before="0" w:after="10" w:line="240" w:lineRule="auto"/>
+        <w:spacing w:before="0" w:after="5" w:line="240" w:lineRule="auto"/>
         <w:ind w:left="288" w:firstLine="0"/>
       </w:pPr>
       <w:r>
         <w:rPr>
           <w:rFonts w:ascii="Times New Roman" w:hAnsi="Times New Roman" w:cs="Times New Roman"/>
-          <w:sz w:val="18"/>
+          <w:sz w:val="17"/>
         </w:rPr>
         <w:t>2.3 Search and Seizure Concepts (Slides 28 to 30)</w:t>
       </w:r>
       <w:r>
         <w:rPr>
           <w:rFonts w:ascii="Arial" w:hAnsi="Arial" w:cs="Arial"/>
-          <w:sz w:val="17"/>
+          <w:sz w:val="16"/>
         </w:rPr>
         <w:tab/>
-        <w:t>8</w:t>
+        <w:t>7</w:t>
       </w:r>
     </w:p>
     <w:p>
@@ -544,23 +544,23 @@
         <w:tabs>
           <w:tab w:pos="9000" w:val="right" w:leader="dot"/>
         </w:tabs>
-        <w:spacing w:before="0" w:after="10" w:line="240" w:lineRule="auto"/>
+        <w:spacing w:before="0" w:after="5" w:line="240" w:lineRule="auto"/>
         <w:ind w:left="288" w:firstLine="0"/>
       </w:pPr>
       <w:r>
         <w:rPr>
           <w:rFonts w:ascii="Times New Roman" w:hAnsi="Times New Roman" w:cs="Times New Roman"/>
-          <w:sz w:val="18"/>
+          <w:sz w:val="17"/>
         </w:rPr>
         <w:t>2.4 Commander's Responsibilities (Slide 7)</w:t>
       </w:r>
       <w:r>
         <w:rPr>
           <w:rFonts w:ascii="Arial" w:hAnsi="Arial" w:cs="Arial"/>
-          <w:sz w:val="17"/>
+          <w:sz w:val="16"/>
         </w:rPr>
         <w:tab/>
-        <w:t>9</w:t>
+        <w:t>8</w:t>
       </w:r>
     </w:p>
     <w:p>
@@ -569,23 +569,23 @@
         <w:tabs>
           <w:tab w:pos="9000" w:val="right" w:leader="dot"/>
         </w:tabs>
-        <w:spacing w:before="0" w:after="10" w:line="240" w:lineRule="auto"/>
+        <w:spacing w:before="0" w:after="5" w:line="240" w:lineRule="auto"/>
         <w:ind w:left="288" w:firstLine="0"/>
       </w:pPr>
       <w:r>
         <w:rPr>
           <w:rFonts w:ascii="Times New Roman" w:hAnsi="Times New Roman" w:cs="Times New Roman"/>
-          <w:sz w:val="18"/>
+          <w:sz w:val="17"/>
         </w:rPr>
         <w:t>2.5 Nonbinding Disposition Guidance (Slide 8)</w:t>
       </w:r>
       <w:r>
         <w:rPr>
           <w:rFonts w:ascii="Arial" w:hAnsi="Arial" w:cs="Arial"/>
-          <w:sz w:val="17"/>
+          <w:sz w:val="16"/>
         </w:rPr>
         <w:tab/>
-        <w:t>9</w:t>
+        <w:t>8</w:t>
       </w:r>
     </w:p>
     <w:p>
@@ -594,23 +594,23 @@
         <w:tabs>
           <w:tab w:pos="9000" w:val="right" w:leader="dot"/>
         </w:tabs>
-        <w:spacing w:before="0" w:after="10" w:line="240" w:lineRule="auto"/>
+        <w:spacing w:before="0" w:after="5" w:line="240" w:lineRule="auto"/>
         <w:ind w:left="288" w:firstLine="0"/>
       </w:pPr>
       <w:r>
         <w:rPr>
           <w:rFonts w:ascii="Times New Roman" w:hAnsi="Times New Roman" w:cs="Times New Roman"/>
-          <w:sz w:val="18"/>
+          <w:sz w:val="17"/>
         </w:rPr>
         <w:t>2.6 Corrective Training (Slide 16)</w:t>
       </w:r>
       <w:r>
         <w:rPr>
           <w:rFonts w:ascii="Arial" w:hAnsi="Arial" w:cs="Arial"/>
-          <w:sz w:val="17"/>
+          <w:sz w:val="16"/>
         </w:rPr>
         <w:tab/>
-        <w:t>9</w:t>
+        <w:t>8</w:t>
       </w:r>
     </w:p>
     <w:p>
@@ -619,23 +619,23 @@
         <w:tabs>
           <w:tab w:pos="9000" w:val="right" w:leader="dot"/>
         </w:tabs>
-        <w:spacing w:before="0" w:after="10" w:line="240" w:lineRule="auto"/>
+        <w:spacing w:before="0" w:after="5" w:line="240" w:lineRule="auto"/>
         <w:ind w:left="288" w:firstLine="0"/>
       </w:pPr>
       <w:r>
         <w:rPr>
           <w:rFonts w:ascii="Times New Roman" w:hAnsi="Times New Roman" w:cs="Times New Roman"/>
-          <w:sz w:val="18"/>
+          <w:sz w:val="17"/>
         </w:rPr>
         <w:t>2.7 Administrative Reprimand, AR 600-37 (Slide 17)</w:t>
       </w:r>
       <w:r>
         <w:rPr>
           <w:rFonts w:ascii="Arial" w:hAnsi="Arial" w:cs="Arial"/>
-          <w:sz w:val="17"/>
+          <w:sz w:val="16"/>
         </w:rPr>
         <w:tab/>
-        <w:t>10</w:t>
+        <w:t>9</w:t>
       </w:r>
     </w:p>
     <w:p>
@@ -644,23 +644,23 @@
         <w:tabs>
           <w:tab w:pos="9000" w:val="right" w:leader="dot"/>
         </w:tabs>
-        <w:spacing w:before="0" w:after="10" w:line="240" w:lineRule="auto"/>
+        <w:spacing w:before="0" w:after="5" w:line="240" w:lineRule="auto"/>
         <w:ind w:left="288" w:firstLine="0"/>
       </w:pPr>
       <w:r>
         <w:rPr>
           <w:rFonts w:ascii="Times New Roman" w:hAnsi="Times New Roman" w:cs="Times New Roman"/>
-          <w:sz w:val="18"/>
+          <w:sz w:val="17"/>
         </w:rPr>
         <w:t>2.8 Inquiries and Investigations (Slides 23 to 24)</w:t>
       </w:r>
       <w:r>
         <w:rPr>
           <w:rFonts w:ascii="Arial" w:hAnsi="Arial" w:cs="Arial"/>
-          <w:sz w:val="17"/>
+          <w:sz w:val="16"/>
         </w:rPr>
         <w:tab/>
-        <w:t>10</w:t>
+        <w:t>9</w:t>
       </w:r>
     </w:p>
     <w:p>
@@ -669,23 +669,23 @@
         <w:tabs>
           <w:tab w:pos="9000" w:val="right" w:leader="dot"/>
         </w:tabs>
-        <w:spacing w:before="0" w:after="10" w:line="240" w:lineRule="auto"/>
+        <w:spacing w:before="0" w:after="5" w:line="240" w:lineRule="auto"/>
         <w:ind w:left="288" w:firstLine="0"/>
       </w:pPr>
       <w:r>
         <w:rPr>
           <w:rFonts w:ascii="Times New Roman" w:hAnsi="Times New Roman" w:cs="Times New Roman"/>
-          <w:sz w:val="18"/>
+          <w:sz w:val="17"/>
         </w:rPr>
         <w:t>2.9 Unlawful Command Influence, Core Concept (Slides 36 to 38)</w:t>
       </w:r>
       <w:r>
         <w:rPr>
           <w:rFonts w:ascii="Arial" w:hAnsi="Arial" w:cs="Arial"/>
-          <w:sz w:val="17"/>
+          <w:sz w:val="16"/>
         </w:rPr>
         <w:tab/>
-        <w:t>10</w:t>
+        <w:t>9</w:t>
       </w:r>
     </w:p>
     <w:p>
@@ -694,23 +694,23 @@
         <w:tabs>
           <w:tab w:pos="9000" w:val="right" w:leader="dot"/>
         </w:tabs>
-        <w:spacing w:before="0" w:after="10" w:line="240" w:lineRule="auto"/>
+        <w:spacing w:before="0" w:after="5" w:line="240" w:lineRule="auto"/>
         <w:ind w:left="288" w:firstLine="0"/>
       </w:pPr>
       <w:r>
         <w:rPr>
           <w:rFonts w:ascii="Times New Roman" w:hAnsi="Times New Roman" w:cs="Times New Roman"/>
-          <w:sz w:val="18"/>
+          <w:sz w:val="17"/>
         </w:rPr>
         <w:t>2.10 Crimes Under the UCMJ (Slide 4)</w:t>
       </w:r>
       <w:r>
         <w:rPr>
           <w:rFonts w:ascii="Arial" w:hAnsi="Arial" w:cs="Arial"/>
-          <w:sz w:val="17"/>
+          <w:sz w:val="16"/>
         </w:rPr>
         <w:tab/>
-        <w:t>10</w:t>
+        <w:t>9</w:t>
       </w:r>
     </w:p>
     <w:p>
@@ -719,18 +719,9 @@
         <w:tabs>
           <w:tab w:pos="9000" w:val="right" w:leader="dot"/>
         </w:tabs>
-        <w:spacing w:before="40" w:after="10" w:line="240" w:lineRule="auto"/>
+        <w:spacing w:before="30" w:after="5" w:line="240" w:lineRule="auto"/>
         <w:ind w:left="0" w:firstLine="0"/>
       </w:pPr>
-      <w:r>
-        <w:rPr>
-          <w:rFonts w:ascii="Arial" w:hAnsi="Arial" w:cs="Arial"/>
-          <w:b/>
-          <w:color w:val="1F3A5F"/>
-          <w:sz w:val="18"/>
-        </w:rPr>
-        <w:t>TIER 3: Reference and Background</w:t>
-      </w:r>
       <w:r>
         <w:rPr>
           <w:rFonts w:ascii="Arial" w:hAnsi="Arial" w:cs="Arial"/>
@@ -738,8 +729,17 @@
           <w:color w:val="1F3A5F"/>
           <w:sz w:val="17"/>
         </w:rPr>
+        <w:t>TIER 3: Reference and Background</w:t>
+      </w:r>
+      <w:r>
+        <w:rPr>
+          <w:rFonts w:ascii="Arial" w:hAnsi="Arial" w:cs="Arial"/>
+          <w:b/>
+          <w:color w:val="1F3A5F"/>
+          <w:sz w:val="16"/>
+        </w:rPr>
         <w:tab/>
-        <w:t>11</w:t>
+        <w:t>10</w:t>
       </w:r>
     </w:p>
     <w:p>
@@ -748,23 +748,23 @@
         <w:tabs>
           <w:tab w:pos="9000" w:val="right" w:leader="dot"/>
         </w:tabs>
-        <w:spacing w:before="0" w:after="10" w:line="240" w:lineRule="auto"/>
+        <w:spacing w:before="0" w:after="5" w:line="240" w:lineRule="auto"/>
         <w:ind w:left="288" w:firstLine="0"/>
       </w:pPr>
       <w:r>
         <w:rPr>
           <w:rFonts w:ascii="Times New Roman" w:hAnsi="Times New Roman" w:cs="Times New Roman"/>
-          <w:sz w:val="18"/>
+          <w:sz w:val="17"/>
         </w:rPr>
         <w:t>3.1 Purpose of the Military Justice System (Slide 2)</w:t>
       </w:r>
       <w:r>
         <w:rPr>
           <w:rFonts w:ascii="Arial" w:hAnsi="Arial" w:cs="Arial"/>
-          <w:sz w:val="17"/>
+          <w:sz w:val="16"/>
         </w:rPr>
         <w:tab/>
-        <w:t>11</w:t>
+        <w:t>10</w:t>
       </w:r>
     </w:p>
     <w:p>
@@ -773,23 +773,23 @@
         <w:tabs>
           <w:tab w:pos="9000" w:val="right" w:leader="dot"/>
         </w:tabs>
-        <w:spacing w:before="0" w:after="10" w:line="240" w:lineRule="auto"/>
+        <w:spacing w:before="0" w:after="5" w:line="240" w:lineRule="auto"/>
         <w:ind w:left="288" w:firstLine="0"/>
       </w:pPr>
       <w:r>
         <w:rPr>
           <w:rFonts w:ascii="Times New Roman" w:hAnsi="Times New Roman" w:cs="Times New Roman"/>
-          <w:sz w:val="18"/>
+          <w:sz w:val="17"/>
         </w:rPr>
         <w:t>3.2 The 10 Commandments of Unlawful Command Influence (Slides 37 to 38)</w:t>
       </w:r>
       <w:r>
         <w:rPr>
           <w:rFonts w:ascii="Arial" w:hAnsi="Arial" w:cs="Arial"/>
-          <w:sz w:val="17"/>
+          <w:sz w:val="16"/>
         </w:rPr>
         <w:tab/>
-        <w:t>11</w:t>
+        <w:t>10</w:t>
       </w:r>
     </w:p>
     <w:p>
@@ -798,23 +798,23 @@
         <w:tabs>
           <w:tab w:pos="9000" w:val="right" w:leader="dot"/>
         </w:tabs>
-        <w:spacing w:before="0" w:after="10" w:line="240" w:lineRule="auto"/>
+        <w:spacing w:before="0" w:after="5" w:line="240" w:lineRule="auto"/>
         <w:ind w:left="288" w:firstLine="0"/>
       </w:pPr>
       <w:r>
         <w:rPr>
           <w:rFonts w:ascii="Times New Roman" w:hAnsi="Times New Roman" w:cs="Times New Roman"/>
-          <w:sz w:val="18"/>
+          <w:sz w:val="17"/>
         </w:rPr>
         <w:t>3.3 Full Administrative Actions List with Regulations (Slide 13)</w:t>
       </w:r>
       <w:r>
         <w:rPr>
           <w:rFonts w:ascii="Arial" w:hAnsi="Arial" w:cs="Arial"/>
-          <w:sz w:val="17"/>
+          <w:sz w:val="16"/>
         </w:rPr>
         <w:tab/>
-        <w:t>11</w:t>
+        <w:t>10</w:t>
       </w:r>
     </w:p>
     <w:p>
@@ -823,23 +823,23 @@
         <w:tabs>
           <w:tab w:pos="9000" w:val="right" w:leader="dot"/>
         </w:tabs>
-        <w:spacing w:before="0" w:after="10" w:line="240" w:lineRule="auto"/>
+        <w:spacing w:before="0" w:after="5" w:line="240" w:lineRule="auto"/>
         <w:ind w:left="288" w:firstLine="0"/>
       </w:pPr>
       <w:r>
         <w:rPr>
           <w:rFonts w:ascii="Times New Roman" w:hAnsi="Times New Roman" w:cs="Times New Roman"/>
-          <w:sz w:val="18"/>
+          <w:sz w:val="17"/>
         </w:rPr>
         <w:t>3.4 The Counseling "Magic Phrase" (Slide 15)</w:t>
       </w:r>
       <w:r>
         <w:rPr>
           <w:rFonts w:ascii="Arial" w:hAnsi="Arial" w:cs="Arial"/>
-          <w:sz w:val="17"/>
+          <w:sz w:val="16"/>
         </w:rPr>
         <w:tab/>
-        <w:t>12</w:t>
+        <w:t>11</w:t>
       </w:r>
     </w:p>
     <w:p>
@@ -848,23 +848,23 @@
         <w:tabs>
           <w:tab w:pos="9000" w:val="right" w:leader="dot"/>
         </w:tabs>
-        <w:spacing w:before="0" w:after="10" w:line="240" w:lineRule="auto"/>
+        <w:spacing w:before="0" w:after="5" w:line="240" w:lineRule="auto"/>
         <w:ind w:left="288" w:firstLine="0"/>
       </w:pPr>
       <w:r>
         <w:rPr>
           <w:rFonts w:ascii="Times New Roman" w:hAnsi="Times New Roman" w:cs="Times New Roman"/>
-          <w:sz w:val="18"/>
+          <w:sz w:val="17"/>
         </w:rPr>
         <w:t>3.5 The Bar to Continued Service (Slide 18)</w:t>
       </w:r>
       <w:r>
         <w:rPr>
           <w:rFonts w:ascii="Arial" w:hAnsi="Arial" w:cs="Arial"/>
-          <w:sz w:val="17"/>
+          <w:sz w:val="16"/>
         </w:rPr>
         <w:tab/>
-        <w:t>12</w:t>
+        <w:t>11</w:t>
       </w:r>
     </w:p>
     <w:p>
@@ -873,18 +873,9 @@
         <w:tabs>
           <w:tab w:pos="9000" w:val="right" w:leader="dot"/>
         </w:tabs>
-        <w:spacing w:before="40" w:after="10" w:line="240" w:lineRule="auto"/>
+        <w:spacing w:before="30" w:after="5" w:line="240" w:lineRule="auto"/>
         <w:ind w:left="0" w:firstLine="0"/>
       </w:pPr>
-      <w:r>
-        <w:rPr>
-          <w:rFonts w:ascii="Arial" w:hAnsi="Arial" w:cs="Arial"/>
-          <w:b/>
-          <w:color w:val="1F3A5F"/>
-          <w:sz w:val="18"/>
-        </w:rPr>
-        <w:t>Rapid Review: Numbers to Memorize</w:t>
-      </w:r>
       <w:r>
         <w:rPr>
           <w:rFonts w:ascii="Arial" w:hAnsi="Arial" w:cs="Arial"/>
@@ -892,8 +883,17 @@
           <w:color w:val="1F3A5F"/>
           <w:sz w:val="17"/>
         </w:rPr>
+        <w:t>Rapid Review: Numbers to Memorize</w:t>
+      </w:r>
+      <w:r>
+        <w:rPr>
+          <w:rFonts w:ascii="Arial" w:hAnsi="Arial" w:cs="Arial"/>
+          <w:b/>
+          <w:color w:val="1F3A5F"/>
+          <w:sz w:val="16"/>
+        </w:rPr>
         <w:tab/>
-        <w:t>12</w:t>
+        <w:t>11</w:t>
       </w:r>
     </w:p>
     <w:p>
@@ -902,18 +902,9 @@
         <w:tabs>
           <w:tab w:pos="9000" w:val="right" w:leader="dot"/>
         </w:tabs>
-        <w:spacing w:before="40" w:after="10" w:line="240" w:lineRule="auto"/>
+        <w:spacing w:before="30" w:after="5" w:line="240" w:lineRule="auto"/>
         <w:ind w:left="0" w:firstLine="0"/>
       </w:pPr>
-      <w:r>
-        <w:rPr>
-          <w:rFonts w:ascii="Arial" w:hAnsi="Arial" w:cs="Arial"/>
-          <w:b/>
-          <w:color w:val="1F3A5F"/>
-          <w:sz w:val="18"/>
-        </w:rPr>
-        <w:t>The Ten Most Likely Missed Details</w:t>
-      </w:r>
       <w:r>
         <w:rPr>
           <w:rFonts w:ascii="Arial" w:hAnsi="Arial" w:cs="Arial"/>
@@ -921,8 +912,17 @@
           <w:color w:val="1F3A5F"/>
           <w:sz w:val="17"/>
         </w:rPr>
+        <w:t>The Ten Most Likely Missed Details</w:t>
+      </w:r>
+      <w:r>
+        <w:rPr>
+          <w:rFonts w:ascii="Arial" w:hAnsi="Arial" w:cs="Arial"/>
+          <w:b/>
+          <w:color w:val="1F3A5F"/>
+          <w:sz w:val="16"/>
+        </w:rPr>
         <w:tab/>
-        <w:t>13</w:t>
+        <w:t>12</w:t>
       </w:r>
     </w:p>
     <w:p>
@@ -931,18 +931,9 @@
         <w:tabs>
           <w:tab w:pos="9000" w:val="right" w:leader="dot"/>
         </w:tabs>
-        <w:spacing w:before="40" w:after="10" w:line="240" w:lineRule="auto"/>
+        <w:spacing w:before="30" w:after="5" w:line="240" w:lineRule="auto"/>
         <w:ind w:left="0" w:firstLine="0"/>
       </w:pPr>
-      <w:r>
-        <w:rPr>
-          <w:rFonts w:ascii="Arial" w:hAnsi="Arial" w:cs="Arial"/>
-          <w:b/>
-          <w:color w:val="1F3A5F"/>
-          <w:sz w:val="18"/>
-        </w:rPr>
-        <w:t>Addendum: Asked in Class</w:t>
-      </w:r>
       <w:r>
         <w:rPr>
           <w:rFonts w:ascii="Arial" w:hAnsi="Arial" w:cs="Arial"/>
@@ -950,8 +941,17 @@
           <w:color w:val="1F3A5F"/>
           <w:sz w:val="17"/>
         </w:rPr>
+        <w:t>Addendum: Asked in Class</w:t>
+      </w:r>
+      <w:r>
+        <w:rPr>
+          <w:rFonts w:ascii="Arial" w:hAnsi="Arial" w:cs="Arial"/>
+          <w:b/>
+          <w:color w:val="1F3A5F"/>
+          <w:sz w:val="16"/>
+        </w:rPr>
         <w:tab/>
-        <w:t>14</w:t>
+        <w:t>13</w:t>
       </w:r>
     </w:p>
     <w:p>
@@ -960,23 +960,23 @@
         <w:tabs>
           <w:tab w:pos="9000" w:val="right" w:leader="dot"/>
         </w:tabs>
-        <w:spacing w:before="0" w:after="10" w:line="240" w:lineRule="auto"/>
+        <w:spacing w:before="0" w:after="5" w:line="240" w:lineRule="auto"/>
         <w:ind w:left="288" w:firstLine="0"/>
       </w:pPr>
       <w:r>
         <w:rPr>
           <w:rFonts w:ascii="Times New Roman" w:hAnsi="Times New Roman" w:cs="Times New Roman"/>
-          <w:sz w:val="18"/>
+          <w:sz w:val="17"/>
         </w:rPr>
         <w:t>A.1 Apprehension in the home: on post or off post? (Slide 28)</w:t>
       </w:r>
       <w:r>
         <w:rPr>
           <w:rFonts w:ascii="Arial" w:hAnsi="Arial" w:cs="Arial"/>
-          <w:sz w:val="17"/>
+          <w:sz w:val="16"/>
         </w:rPr>
         <w:tab/>
-        <w:t>14</w:t>
+        <w:t>13</w:t>
       </w:r>
       <w:r>
         <w:fldChar w:fldCharType="end"/>
@@ -1115,6 +1115,7 @@
     </w:p>
     <w:p>
       <w:pPr>
+        <w:pStyle w:val="Heading1"/>
         <w:keepNext/>
         <w:pageBreakBefore/>
         <w:pBdr>
@@ -1150,6 +1151,7 @@
     </w:p>
     <w:p>
       <w:pPr>
+        <w:pStyle w:val="Heading2"/>
         <w:keepNext/>
         <w:pBdr>
           <w:bottom w:val="single" w:sz="4" w:space="2" w:color="C4C4C4"/>
@@ -1342,6 +1344,7 @@
     </w:p>
     <w:p>
       <w:pPr>
+        <w:pStyle w:val="Heading3"/>
         <w:keepNext/>
         <w:spacing w:before="160" w:after="80"/>
       </w:pPr>
@@ -1521,6 +1524,7 @@
     </w:p>
     <w:p>
       <w:pPr>
+        <w:pStyle w:val="Heading3"/>
         <w:keepNext/>
         <w:spacing w:before="160" w:after="80"/>
       </w:pPr>
@@ -1664,6 +1668,7 @@
     </w:p>
     <w:p>
       <w:pPr>
+        <w:pStyle w:val="Heading2"/>
         <w:keepNext/>
         <w:pBdr>
           <w:bottom w:val="single" w:sz="4" w:space="2" w:color="C4C4C4"/>
@@ -1827,6 +1832,7 @@
     </w:p>
     <w:p>
       <w:pPr>
+        <w:pStyle w:val="Heading2"/>
         <w:keepNext/>
         <w:pBdr>
           <w:bottom w:val="single" w:sz="4" w:space="2" w:color="C4C4C4"/>
@@ -2121,6 +2127,7 @@
     </w:p>
     <w:p>
       <w:pPr>
+        <w:pStyle w:val="Heading2"/>
         <w:keepNext/>
         <w:pBdr>
           <w:bottom w:val="single" w:sz="4" w:space="2" w:color="C4C4C4"/>
@@ -2307,6 +2314,7 @@
     </w:p>
     <w:p>
       <w:pPr>
+        <w:pStyle w:val="Heading2"/>
         <w:keepNext/>
         <w:pBdr>
           <w:bottom w:val="single" w:sz="4" w:space="2" w:color="C4C4C4"/>
@@ -2477,6 +2485,7 @@
     </w:p>
     <w:p>
       <w:pPr>
+        <w:pStyle w:val="Heading2"/>
         <w:keepNext/>
         <w:pBdr>
           <w:bottom w:val="single" w:sz="4" w:space="2" w:color="C4C4C4"/>
@@ -2852,6 +2861,7 @@
     </w:p>
     <w:p>
       <w:pPr>
+        <w:pStyle w:val="Heading2"/>
         <w:keepNext/>
         <w:pBdr>
           <w:bottom w:val="single" w:sz="4" w:space="2" w:color="C4C4C4"/>
@@ -3106,6 +3116,7 @@
     </w:p>
     <w:p>
       <w:pPr>
+        <w:pStyle w:val="Heading2"/>
         <w:keepNext/>
         <w:pBdr>
           <w:bottom w:val="single" w:sz="4" w:space="2" w:color="C4C4C4"/>
@@ -3903,6 +3914,7 @@
     </w:p>
     <w:p>
       <w:pPr>
+        <w:pStyle w:val="Heading2"/>
         <w:keepNext/>
         <w:pBdr>
           <w:bottom w:val="single" w:sz="4" w:space="2" w:color="C4C4C4"/>
@@ -4043,6 +4055,7 @@
     </w:p>
     <w:p>
       <w:pPr>
+        <w:pStyle w:val="Heading2"/>
         <w:keepNext/>
         <w:pBdr>
           <w:bottom w:val="single" w:sz="4" w:space="2" w:color="C4C4C4"/>
@@ -4226,6 +4239,7 @@
     </w:p>
     <w:p>
       <w:pPr>
+        <w:pStyle w:val="Heading2"/>
         <w:keepNext/>
         <w:pBdr>
           <w:bottom w:val="single" w:sz="4" w:space="2" w:color="C4C4C4"/>
@@ -4245,6 +4259,7 @@
     </w:p>
     <w:p>
       <w:pPr>
+        <w:pStyle w:val="Heading3"/>
         <w:keepNext/>
         <w:spacing w:before="160" w:after="80"/>
       </w:pPr>
@@ -4400,6 +4415,7 @@
     </w:p>
     <w:p>
       <w:pPr>
+        <w:pStyle w:val="Heading3"/>
         <w:keepNext/>
         <w:spacing w:before="160" w:after="80"/>
       </w:pPr>
@@ -4607,6 +4623,7 @@
     </w:p>
     <w:p>
       <w:pPr>
+        <w:pStyle w:val="Heading2"/>
         <w:keepNext/>
         <w:pBdr>
           <w:bottom w:val="single" w:sz="4" w:space="2" w:color="C4C4C4"/>
@@ -4790,6 +4807,7 @@
     </w:p>
     <w:p>
       <w:pPr>
+        <w:pStyle w:val="Heading2"/>
         <w:keepNext/>
         <w:pBdr>
           <w:bottom w:val="single" w:sz="4" w:space="2" w:color="C4C4C4"/>
@@ -5028,6 +5046,7 @@
     </w:p>
     <w:p>
       <w:pPr>
+        <w:pStyle w:val="Heading1"/>
         <w:keepNext/>
         <w:pageBreakBefore/>
         <w:pBdr>
@@ -5063,6 +5082,7 @@
     </w:p>
     <w:p>
       <w:pPr>
+        <w:pStyle w:val="Heading2"/>
         <w:keepNext/>
         <w:pBdr>
           <w:bottom w:val="single" w:sz="4" w:space="2" w:color="C4C4C4"/>
@@ -5363,6 +5383,7 @@
     </w:p>
     <w:p>
       <w:pPr>
+        <w:pStyle w:val="Heading2"/>
         <w:keepNext/>
         <w:pBdr>
           <w:bottom w:val="single" w:sz="4" w:space="2" w:color="C4C4C4"/>
@@ -5485,6 +5506,7 @@
     </w:p>
     <w:p>
       <w:pPr>
+        <w:pStyle w:val="Heading2"/>
         <w:keepNext/>
         <w:pBdr>
           <w:bottom w:val="single" w:sz="4" w:space="2" w:color="C4C4C4"/>
@@ -5755,6 +5777,7 @@
     </w:p>
     <w:p>
       <w:pPr>
+        <w:pStyle w:val="Heading2"/>
         <w:keepNext/>
         <w:pBdr>
           <w:bottom w:val="single" w:sz="4" w:space="2" w:color="C4C4C4"/>
@@ -5907,6 +5930,7 @@
     </w:p>
     <w:p>
       <w:pPr>
+        <w:pStyle w:val="Heading2"/>
         <w:keepNext/>
         <w:pBdr>
           <w:bottom w:val="single" w:sz="4" w:space="2" w:color="C4C4C4"/>
@@ -6160,6 +6184,7 @@
     </w:p>
     <w:p>
       <w:pPr>
+        <w:pStyle w:val="Heading2"/>
         <w:keepNext/>
         <w:pBdr>
           <w:bottom w:val="single" w:sz="4" w:space="2" w:color="C4C4C4"/>
@@ -6354,6 +6379,7 @@
     </w:p>
     <w:p>
       <w:pPr>
+        <w:pStyle w:val="Heading2"/>
         <w:keepNext/>
         <w:pBdr>
           <w:bottom w:val="single" w:sz="4" w:space="2" w:color="C4C4C4"/>
@@ -6539,6 +6565,7 @@
     </w:p>
     <w:p>
       <w:pPr>
+        <w:pStyle w:val="Heading2"/>
         <w:keepNext/>
         <w:pBdr>
           <w:bottom w:val="single" w:sz="4" w:space="2" w:color="C4C4C4"/>
@@ -6780,6 +6807,7 @@
     </w:p>
     <w:p>
       <w:pPr>
+        <w:pStyle w:val="Heading2"/>
         <w:keepNext/>
         <w:pBdr>
           <w:bottom w:val="single" w:sz="4" w:space="2" w:color="C4C4C4"/>
@@ -6894,6 +6922,7 @@
     </w:p>
     <w:p>
       <w:pPr>
+        <w:pStyle w:val="Heading2"/>
         <w:keepNext/>
         <w:pBdr>
           <w:bottom w:val="single" w:sz="4" w:space="2" w:color="C4C4C4"/>
@@ -6965,6 +6994,7 @@
     </w:p>
     <w:p>
       <w:pPr>
+        <w:pStyle w:val="Heading1"/>
         <w:keepNext/>
         <w:pageBreakBefore/>
         <w:pBdr>
@@ -7000,6 +7030,7 @@
     </w:p>
     <w:p>
       <w:pPr>
+        <w:pStyle w:val="Heading2"/>
         <w:keepNext/>
         <w:pBdr>
           <w:bottom w:val="single" w:sz="4" w:space="2" w:color="C4C4C4"/>
@@ -7127,6 +7158,7 @@
     </w:p>
     <w:p>
       <w:pPr>
+        <w:pStyle w:val="Heading2"/>
         <w:keepNext/>
         <w:pBdr>
           <w:bottom w:val="single" w:sz="4" w:space="2" w:color="C4C4C4"/>
@@ -7413,6 +7445,7 @@
     </w:p>
     <w:p>
       <w:pPr>
+        <w:pStyle w:val="Heading2"/>
         <w:keepNext/>
         <w:pBdr>
           <w:bottom w:val="single" w:sz="4" w:space="2" w:color="C4C4C4"/>
@@ -8214,6 +8247,7 @@
     </w:p>
     <w:p>
       <w:pPr>
+        <w:pStyle w:val="Heading2"/>
         <w:keepNext/>
         <w:pBdr>
           <w:bottom w:val="single" w:sz="4" w:space="2" w:color="C4C4C4"/>
@@ -8272,6 +8306,7 @@
     </w:p>
     <w:p>
       <w:pPr>
+        <w:pStyle w:val="Heading2"/>
         <w:keepNext/>
         <w:pBdr>
           <w:bottom w:val="single" w:sz="4" w:space="2" w:color="C4C4C4"/>
@@ -8318,6 +8353,7 @@
     </w:p>
     <w:p>
       <w:pPr>
+        <w:pStyle w:val="Heading1"/>
         <w:keepNext/>
         <w:pBdr>
           <w:bottom w:val="single" w:sz="16" w:space="2" w:color="1F3A5F"/>
@@ -9262,6 +9298,7 @@
     </w:p>
     <w:p>
       <w:pPr>
+        <w:pStyle w:val="Heading1"/>
         <w:keepNext/>
         <w:pBdr>
           <w:bottom w:val="single" w:sz="16" w:space="2" w:color="1F3A5F"/>
@@ -9619,6 +9656,7 @@
     </w:p>
     <w:p>
       <w:pPr>
+        <w:pStyle w:val="Heading1"/>
         <w:keepNext/>
         <w:pageBreakBefore/>
         <w:pBdr>
@@ -9665,6 +9703,7 @@
     </w:p>
     <w:p>
       <w:pPr>
+        <w:pStyle w:val="Heading2"/>
         <w:keepNext/>
         <w:pBdr>
           <w:bottom w:val="single" w:sz="4" w:space="2" w:color="C4C4C4"/>

</xml_diff>